<commit_message>
docs(delivery): refresh tested amd64 submission
</commit_message>
<xml_diff>
--- a/deliverables/campus-market-x64/docs/性能问题与竞态资源问题处理报告.docx
+++ b/deliverables/campus-market-x64/docs/性能问题与竞态资源问题处理报告.docx
@@ -111,7 +111,7 @@
           <w:color w:val="111111"/>
           <w:sz w:val="21"/>
         </w:rPr>
-        <w:t>2026 年 9 月 1 日</w:t>
+        <w:t>2026 年 10 月 10 日</w:t>
       </w:r>
     </w:p>
     <w:p>
@@ -133,7 +133,7 @@
           <w:color w:val="111111"/>
           <w:sz w:val="21"/>
         </w:rPr>
-        <w:t>5 项集成测试全部通过，含 2 项并发回归测试</w:t>
+        <w:t>8 项集成测试全部通过，含 2 项并发回归测试</w:t>
       </w:r>
     </w:p>
     <w:p>
@@ -1159,7 +1159,7 @@
           <w:color w:val="111111"/>
           <w:sz w:val="22"/>
         </w:rPr>
-        <w:t>本次执行 Maven 集成测试共 5 项，结果为 5 通过、0 失败、0 错误。除登录鉴权、完整订单状态机、参数校验和图片上传外，新增两项并发回归测试：</w:t>
+        <w:t>Maven 集成测试共 8 项，结果为 8 通过、0 失败、0 错误，覆盖鉴权、订单状态机、参数与上传、分页边界、管理动作、停用分类及 500 字举报入库。其中两项并发回归测试为：</w:t>
       </w:r>
     </w:p>
     <w:p>
@@ -1208,7 +1208,20 @@
           <w:color w:val="111111"/>
           <w:sz w:val="22"/>
         </w:rPr>
-        <w:t>测试使用 H2 的 MySQL 兼容模式验证应用级事务和锁调用；最终交付环境使用 MySQL 8.4/InnoDB。镜像通过 Docker Compose 启动后还应执行登录、商品浏览、下单和上传图片的冒烟测试，并检查数据和资源在容器重建后仍然存在。</w:t>
+        <w:t>边界回归还验证了分页参数归一化、反向价格区间、未知管理动作、停用分类和 500 字长文本入库。</w:t>
+      </w:r>
+    </w:p>
+    <w:p>
+      <w:pPr>
+        <w:widowControl/>
+      </w:pPr>
+      <w:r>
+        <w:rPr>
+          <w:rFonts w:ascii="Calibri" w:hAnsi="Calibri" w:eastAsia="Microsoft YaHei"/>
+          <w:color w:val="111111"/>
+          <w:sz w:val="22"/>
+        </w:rPr>
+        <w:t>测试以 H2 的 MySQL 兼容模式验证事务与锁，最终交付使用 MySQL 8.4/InnoDB；Docker Compose 冒烟测试覆盖登录、浏览、下单、上传及重启后的持久化。</w:t>
       </w:r>
     </w:p>
     <w:p>
@@ -1345,7 +1358,7 @@
           <w:color w:val="111111"/>
           <w:sz w:val="22"/>
         </w:rPr>
-        <w:t>本次处理将最重要的数据一致性风险集中到数据库事务和行锁中解决：同一商品不能生成两笔有效订单，订单状态不能并发越级，收藏和浏览计数不会因普通并发而丢失，重复评价和重复举报处理受到锁与唯一约束双重保护。性能方面已完成分页限流、热点索引、原子计数、静态资源分流和持久化挂载，并明确保留 N+1 查询与全文搜索作为下一阶段优化项。当前实现适合课程项目和中小规模校园使用场景。</w:t>
+        <w:t>本次处理以事务、行锁和唯一约束保护订单、商品、收藏、浏览、评价与举报数据，并完成分页限流、热点索引、原子计数、静态资源分流和持久化挂载。N+1 查询与全文搜索留作后续优化。当前实现适合课程项目和中小规模校园场景。</w:t>
       </w:r>
     </w:p>
     <w:sectPr>

</xml_diff>